<commit_message>
Voeg rubriek Algemeen, Feedback module en CSRF beveiliging toe, en werk documentatie bij
- Voeg nieuwe rubriek 'Algemeen' toe aan het menu met 'Feedback' en 'Privacy & AVG'.
- Implementeer Feedback module met keuzes 'Voorstel' en 'Foutje?', automatische indiener/tijdstip registratie, en screenshot upload.
- Stemfunctionaliteit met duimpjes (voor/tegen) en compacte tellers.
- Conversatiedraad per feedbackitem met automatische auteur en tijdstip.
- Rolgebaseerde rechten (lezers mogen enkel bekijken; beheerders kunnen items afsluiten en heropenen).
- Dalende sortering op creatietijdstip en greyed-out weergave voor afgesloten items.
- CSRF-beveiligingstokens toegevoegd aan alle feedback formulieren.
- Zorg dat het 'Data' kopje ook voor medewerkers zichtbaar is.
- Uitgebreide testsuite toegevoegd in tests/test_feedback.py.
- Gebruikershandleiding (Digidokters_Gebruikershandleiding.docx) en README.md bijgewerkt.
</commit_message>
<xml_diff>
--- a/Digidokters_Gebruikershandleiding.docx
+++ b/Digidokters_Gebruikershandleiding.docx
@@ -420,6 +420,41 @@
     </w:p>
     <w:p>
       <w:pPr>
+        <w:pStyle w:val="Heading2"/>
+      </w:pPr>
+      <w:r>
+        <w:t>3.8 Feedback &amp; Meedenken (Foutjes &amp; Voorstellen)</w:t>
+      </w:r>
+    </w:p>
+    <w:p>
+      <w:pPr/>
+      <w:r>
+        <w:t>Onder de nieuwe rubriek 'Algemeen' in het linkermenu vindt u de pagina 'Feedback'. Hier kunnen gebruikers meldingen indienen en met elkaar overleggen om het platform verder te optimaliseren. Onder 'Algemeen' staat tevens het privacystatement ('Privacy &amp; AVG').</w:t>
+        <w:br/>
+        <w:t>• Type melding: Bij het indienen kiest u tussen 'Voorstel' (ideeën voor handige verbeteringen of nieuwe mogelijkheden) of 'Foutje?' (wanneer iets niet naar behoren functioneert).</w:t>
+        <w:br/>
+        <w:t>• Automatische gegevens: Uw gebruikersnaam en het precieze tijdstip van indienen worden automatisch geregistreerd en kunnen niet gewijzigd worden om de betrouwbaarheid te waarborgen.</w:t>
+        <w:br/>
+        <w:t>• Onderwerp &amp; Beschrijving: Geef een duidelijke samenvatting als onderwerp en licht het voorstel of het foutje toe in het vrije tekstveld van de beschrijving.</w:t>
+        <w:br/>
+        <w:t>• Screenshot toevoegen: U kunt optioneel een schermafbeelding uploaden (PNG, JPG, JPEG, GIF of WEBP tot 5 MB). In de detailweergave kan de afbeelding eenvoudig vergroot worden bekeken.</w:t>
+        <w:br/>
+        <w:t>• Stemmen met duimpjes: Alle gebruikers kunnen hun stem uitbrengen met een duim omhoog (👍) of duim omlaag (👎). Het totale aantal stemmen staat compact naast elk duimpje vermeld. Klikt u nogmaals op hetzelfde duimpje, dan wordt uw stem weer ingetrokken.</w:t>
+        <w:br/>
+        <w:t>• Conversatie per feedback: Onder elk item kan een inhoudelijk gesprek gevoerd worden via reacties. Voor elke bijdrage registreert het platform automatisch de auteur en het tijdstip.</w:t>
+        <w:br/>
+        <w:t>• Toegangsrechten: Deze pagina is beschikbaar voor alle gebruikers binnen de organisatie. Gebruikers met de rol 'lezer' hebben enkel leesrechten (kunnen alle items en reacties bekijken, maar kunnen zelf niets invoeren, stemmen of reageren).</w:t>
+        <w:br/>
+        <w:t>• Afsluiten door beheerders: Beheerders hebben de mogelijkheid om een feedbackitem 'Af te sluiten' zodra een voorstel is gerealiseerd of een foutje is hersteld. Een afgesloten item wordt vergrendeld (er kan niet meer op gestemd of gereageerd worden). Indien gewenst kan een beheerder het item later weer heropenen.</w:t>
+        <w:br/>
+        <w:t>• Overzichtslijst &amp; Status: De lijst is chronologisch geordend (nieuwste items bovenaan). Afgesloten items worden herkenbaar grijs getoond (greyed out) met een slotsymbool. Via snelfilters schakelt u gemakkelijk tussen 'Alle', 'Open' en 'Afgesloten', of filtert u op type en vrije zoektermen.</w:t>
+      </w:r>
+    </w:p>
+    <w:p>
+      <w:pPr/>
+    </w:p>
+    <w:p>
+      <w:pPr>
         <w:pStyle w:val="Heading1"/>
       </w:pPr>
       <w:r>

</xml_diff>

<commit_message>
docs: werk handleidingen en rollen/rechten bij en voeg functionele release notes docx toe
</commit_message>
<xml_diff>
--- a/Digidokters_Gebruikershandleiding.docx
+++ b/Digidokters_Gebruikershandleiding.docx
@@ -295,7 +295,7 @@
     <w:p>
       <w:pPr/>
       <w:r>
-        <w:t>Het menu-item 'Registraties' toont een overzicht van alle geregistreerde bezoeken: datum, cliënt, digidokter, herkomst, onderwerp, leeftijdscategorie en toestel. U kan de lijst doorzoeken en filteren. Medewerkers en beheerders kunnen hier ook registraties verwijderen (wissen) bij invoerfouten.</w:t>
+        <w:t>Het menu-item 'Registraties' toont een overzicht van alle geregistreerde consultaties: datum, bezoeker, digidokter, nieuwe bezoeker (ja/nee), herkomst, onderwerp, leeftijdscategorie en toestel. U kan de lijst doorzoeken en filteren. Medewerkers en beheerders kunnen hier ook registraties verwijderen (wissen) bij invoerfouten.</w:t>
       </w:r>
     </w:p>
     <w:p>
@@ -309,7 +309,7 @@
     <w:p>
       <w:pPr/>
       <w:r>
-        <w:t>Klik in het menu op 'Nieuw bezoek' om een nieuwe registratie toe te voegen. Vul de gevraagde gegevens in (datum, naam van de cliënt, digidokter, herkomst, leeftijdscategorie, toestel en een korte omschrijving van de hulpvraag) en klik op 'Opslaan'.</w:t>
+        <w:t>Klik in het menu op 'Nieuw bezoek' om een nieuwe registratie toe te voegen. De app selecteert automatisch uw eigen naam als standaard Digidokter, wat extra invoertijd bespaart. Vul de gevraagde gegevens in (datum, naam van de bezoeker, of het om een nieuwe bezoeker gaat, digidokter, herkomst, leeftijdscategorie, toestel en een korte functionele omschrijving van de hulpvraag) en klik op 'Opslaan'. Na het opslaan start de applicatie op de achtergrond automatisch een analyse via Gemini AI, die de hulpvraag indeelt in de passende categorie ten behoeve van de statistieken.</w:t>
       </w:r>
     </w:p>
     <w:p>
@@ -317,9 +317,9 @@
       <w:r>
         <w:t>Belangrijk (AVG/GDPR-richtlijnen):</w:t>
         <w:br/>
-        <w:t>• Dataminimalisatie: Noteer bij 'Cliënt' uitsluitend de voornaam of initialen (bijv. 'Jan' of 'J.P.'). Voer om privacyredenen geen volledige namen in.</w:t>
+        <w:t>• Dataminimalisatie: Noteer bij 'Bezoeker' uitsluitend de voornaam of initialen (bijv. 'Jan' of 'J.P.'). Voer om privacyredenen nooit volledige achternamen in.</w:t>
         <w:br/>
-        <w:t>• Anoniem omschrijven: Houd de omschrijving van de hulpvraag bij 'Onderwerp' functioneel en anoniem. Voer geen medische of andere gevoelige gegevens in (schrijf dus: 'Hulp bij inloggen eHealth' in plaats van 'Hulp bij inloggen MyHealth vanwege diabetesrapport').</w:t>
+        <w:t>• Anoniem omschrijven: Houd de omschrijving van de hulpvraag bij 'Onderwerp' functioneel en anoniem. Voer geen medische, financiële of andere gevoelige persoonsgegevens in (schrijf dus: 'Hulp bij inloggen eHealth' in plaats van 'Hulp bij inloggen MyHealth vanwege ziekte X').</w:t>
       </w:r>
     </w:p>
     <w:p>
@@ -333,7 +333,7 @@
     <w:p>
       <w:pPr/>
       <w:r>
-        <w:t>Via 'Exporteren' kan u alle (of gefilterde) registraties downloaden als Excel-bestand.</w:t>
+        <w:t>Via 'Exporteren' kan u alle (of gefilterde) registraties downloaden als Excel- (.xlsx) of CSV-bestand. De gedownloade tabellen bevatten gestandaardiseerde kolomkoppen (waaronder 'Bezoeker' en 'Nieuwe bezoeker') voor eenvoudige verwerking in externe rapporten.</w:t>
       </w:r>
     </w:p>
     <w:p>
@@ -347,7 +347,18 @@
     <w:p>
       <w:pPr/>
       <w:r>
-        <w:t>Onder 'Statistieken' vindt u overzichten en grafieken verdeeld over twee tabbladen: 'Bezoekers &amp; Consultaties' (bezoeken, leeftijdscategorieën, toestellen, herkomst, geslachtsverdeling en wekelijkse trends) en 'Vrijwilligers &amp; Agenda' (totaal gepresteerde uren door digidokters, urentrend per maand, inzet per digidokter, sessies per locatie/type en de bezoeker/vrijwilliger-ratio). De 'Bezoeker/vrijwilliger-ratio' (druktest) houdt uitsluitend rekening met activiteiten uit het verleden, omdat toekomstige activiteiten meestal nog geen geregistreerde bezoeken hebben.</w:t>
+        <w:t>Onder 'Statistieken' vindt u gedetailleerde overzichten, KPI's en grafieken verdeeld over drie gespecialiseerde tabbladen:</w:t>
+        <w:br/>
+        <w:t>• Tab 1: Bezoekers &amp; Consultaties: Totaal aantal consultaties, verdeling nieuwe versus terugkerende bezoekers, leeftijdscategorieën, toestellen, herkomstkanalen, geslachtsverdeling en wekelijkse bezoekerstrends.</w:t>
+        <w:br/>
+        <w:t>• Tab 2: Vrijwilligers &amp; Agenda: Totaal aantal gepresteerde uren door digidokters, maandelijkse inzet-trends, sessies per locatie en activiteitstype, en de bezoeker/vrijwilliger-ratio (druktest). Deze ratio houdt uitsluitend rekening met voorbije sessies.</w:t>
+        <w:br/>
+        <w:t>• Tab 3: Vragen &amp; AI-Analyse: Diepgaande analyse van de geregistreerde hulpvragen via Gemini AI. Toont de dekkingsgraad (percentage geanalyseerd), de meest voorkomende vraagcategorie, gemiddelde betrouwbaarheidsscore, een categorie-staafdiagram, een maandelijkse evolutiegrafiek van de top-5 categorieën, en kruistabellen met de populairste toestellen en leeftijdsgroepen per vraagcategorie.</w:t>
+        <w:br/>
+        <w:br/>
+        <w:t>Jaarfilter &amp; 'Alle jaren':</w:t>
+        <w:br/>
+        <w:t>Bovenaan de statistiekenpagina kunt u snel filteren op een specifiek kalenderjaar of kiezen voor 'Alle jaren' om de cumulatieve werking over de volledige looptijd te analyseren. Bij het wisselen van jaartal blijft het momenteel geopende tabblad automatisch actief.</w:t>
       </w:r>
     </w:p>
     <w:p>
@@ -448,6 +459,48 @@
         <w:t>• Afsluiten door beheerders: Beheerders hebben de mogelijkheid om een feedbackitem 'Af te sluiten' zodra een voorstel is gerealiseerd of een foutje is hersteld. Een afgesloten item wordt vergrendeld (er kan niet meer op gestemd of gereageerd worden). Indien gewenst kan een beheerder het item later weer heropenen.</w:t>
         <w:br/>
         <w:t>• Overzichtslijst &amp; Status: De lijst is chronologisch geordend (nieuwste items bovenaan). Afgesloten items worden herkenbaar grijs getoond (greyed out) met een slotsymbool. Via snelfilters schakelt u gemakkelijk tussen 'Alle', 'Open' en 'Afgesloten', of filtert u op type en vrije zoektermen.</w:t>
+      </w:r>
+    </w:p>
+    <w:p>
+      <w:pPr/>
+    </w:p>
+    <w:p>
+      <w:pPr>
+        <w:pStyle w:val="Heading2"/>
+      </w:pPr>
+      <w:r>
+        <w:t>3.9 App documentatie (Centraal &amp; Gemeenschappelijk)</w:t>
+      </w:r>
+    </w:p>
+    <w:p>
+      <w:pPr/>
+      <w:r>
+        <w:t>Onder de rubriek 'Algemeen' in het linkermenu — precies tussen 'Feedback' en 'Privacy &amp; AVG' — vindt u de nieuwe pagina 'App documentatie'.</w:t>
+        <w:br/>
+        <w:t>• Doel &amp; Inhoud: Deze centrale bibliotheek bevat overkoepelende documenten die van belang zijn voor alle organisaties, zoals de gebruikershandleiding, GDPR- en security-auditverslagen, sjablonen en technische specificaties. Documenten hoeven hierdoor niet meer per gemeente afzonderlijk geüpload of geüpdatet te worden.</w:t>
+        <w:br/>
+        <w:t>• Voor alle gebruikers: Iedereen (zowel lezers, medewerkers als beheerders van elke organisatie) kan de mappen openen, documenten downloaden, inline bekijken (PDF en afbeeldingen) en gebruikmaken van de ingebouwde zoekbalk inclusief tekstzoekindex.</w:t>
+        <w:br/>
+        <w:t>• Beheer door platformbeheerder: Om te vermijden dat centrale documenten per ongeluk worden gewijzigd of gewist, zijn upload-, hernoem-, versie-overschrijf- en verwijderacties exclusief voorbehouden aan de platformbeheerder.</w:t>
+      </w:r>
+    </w:p>
+    <w:p>
+      <w:pPr/>
+    </w:p>
+    <w:p>
+      <w:pPr>
+        <w:pStyle w:val="Heading2"/>
+      </w:pPr>
+      <w:r>
+        <w:t>3.10 Inklapbare rubrieken in het linkermenu</w:t>
+      </w:r>
+    </w:p>
+    <w:p>
+      <w:pPr/>
+      <w:r>
+        <w:t>Om het scherm overzichtelijk en rustig te houden, zijn alle hoofdrubrieken in het linkermenu (Platformbeheer, Registraties, Documentbeheer, Beheer, Data en Algemeen) inklapbaar gemaakt.</w:t>
+        <w:br/>
+        <w:t>Klik op de titel van een rubriek of het pijltje om een sectie in of uit te klappen. Uw voorkeur wordt automatisch onthouden in uw webbrowser via lokale opslag, zodat uw favoriete weergave bewaard blijft bij volgende bezoeken.</w:t>
       </w:r>
     </w:p>
     <w:p>
@@ -606,6 +659,12 @@
         <w:t xml:space="preserve">  - Real-time live previewpaneel dat de e-mail met realistische voorbeelddata direct toont tijdens het typen.</w:t>
         <w:br/>
         <w:t xml:space="preserve">  - Fabrieksherstel via de knop 'Herstel naar standaard' om een sjabloon te allen tijde terug te zetten naar de originele standaardtekst.</w:t>
+        <w:br/>
+        <w:t>• Vraagcategorieën beheren: Onder 'Platformbeheer &gt; Vraagcategorieën' beheert de platformbeheerder de centrale stamgegevens voor de AI-analyse (toevoegen, wijzigen, omschrijving/richtlijnen voor Gemini AI aanpassen, volgorde wijzigen en in-/uitschakelen). Deze categorieën zijn gemeenschappelijk voor alle gemeenten.</w:t>
+        <w:br/>
+        <w:t>• Vraagclassificaties opvolgen &amp; overriden: Onder 'Platformbeheer &gt; Vraagclassificaties' vindt u het centrale monitoringoverzicht van alle geanalyseerde vragen. Met visuele kleurcodes (groen, oranje, rood) ziet u de betrouwbaarheid van de AI. U kunt handmatig categorieën corrigeren (waarbij 'Handmatig aangepast' wordt geregistreerd), met één klik een vraag opnieuw door Gemini laten analyseren, of een batch-analyse starten op resterende vragen.</w:t>
+        <w:br/>
+        <w:t>• Centraal beheer van App documentatie: Platformbeheerders hebben exclusieve schrijfrechten om binnen 'App documentatie' centrale mappen en bestanden te uploaden, bewerken, overschrijven (versiebeheer) of wissen voor het gehele platform.</w:t>
       </w:r>
     </w:p>
     <w:p>

</xml_diff>

<commit_message>
feat(feedback): voeg weergaven-tracking en permanente klikbare notificaties toe
</commit_message>
<xml_diff>
--- a/Digidokters_Gebruikershandleiding.docx
+++ b/Digidokters_Gebruikershandleiding.docx
@@ -459,6 +459,16 @@
         <w:t>• Afsluiten door beheerders: Beheerders hebben de mogelijkheid om een feedbackitem 'Af te sluiten' zodra een voorstel is gerealiseerd of een foutje is hersteld. Een afgesloten item wordt vergrendeld (er kan niet meer op gestemd of gereageerd worden). Indien gewenst kan een beheerder het item later weer heropenen.</w:t>
         <w:br/>
         <w:t>• Overzichtslijst &amp; Status: De lijst is chronologisch geordend (nieuwste items bovenaan). Afgesloten items worden herkenbaar grijs getoond (greyed out) met een slotsymbool. Via snelfilters schakelt u gemakkelijk tussen 'Alle', 'Open' en 'Afgesloten', of filtert u op type en vrije zoektermen.</w:t>
+        <w:br/>
+        <w:t>• Automatische weergaven-registratie: Het platform houdt per gebruiker nauwkeurig bij wanneer u de feedback-overzichtslijst of een specifieke detailpagina voor het laatst heeft bekeken.</w:t>
+        <w:br/>
+        <w:t>• Klikbare notificaties bovenaan elke pagina: Op basis van uw laatste bezoek toont het platform direct bovenaan elke pagina een klikbare blauwe notificatiebanner:</w:t>
+        <w:br/>
+        <w:t xml:space="preserve">  - Nieuwe reactie op uw feedback: Zodra een collega reageert op een door u ingediend feedback-item, ziet u meteen een melding (bijv. 'Nieuwe reactie op uw feedback "Printer hapert" van CollegaKarel') met directe link naar het item.</w:t>
+        <w:br/>
+        <w:t xml:space="preserve">  - Nieuw feedback-item door collega: Zodra een collega binnen uw organisatie een nieuw voorstel of foutje indient dat u nog niet heeft gezien, verschijnt een melding met een knop om het direct te bekijken.</w:t>
+        <w:br/>
+        <w:t>• Permanente weergave &amp; Wegklikken: Deze notificatie blijft zichtbaar tot u het betreffende feedback-item heeft geopend, of totdat u op het kruisje (×) klikt om de melding als gelezen te markeren.</w:t>
       </w:r>
     </w:p>
     <w:p>

</xml_diff>

<commit_message>
Voeg filters toe op registratieoverzicht en ondersteun mapping van gedeactiveerde toestellen en leeftijdscategorieen
</commit_message>
<xml_diff>
--- a/Digidokters_Gebruikershandleiding.docx
+++ b/Digidokters_Gebruikershandleiding.docx
@@ -295,7 +295,7 @@
     <w:p>
       <w:pPr/>
       <w:r>
-        <w:t>Het menu-item 'Registraties' toont een overzicht van alle geregistreerde consultaties: datum, bezoeker, digidokter, nieuwe bezoeker (ja/nee), herkomst, onderwerp, leeftijdscategorie en toestel. U kan de lijst doorzoeken en filteren. Medewerkers en beheerders kunnen hier ook registraties verwijderen (wissen) bij invoerfouten.</w:t>
+        <w:t>Het menu-item 'Registraties' toont een overzicht van alle geregistreerde consultaties: datum, bezoeker, digidokter, nieuwe bezoeker (ja/nee), herkomst, onderwerp, leeftijdscategorie en toestel. U kan de lijst doorzoeken en uitgebreid filteren op digidokter, toesteltype, geslacht, leeftijdscategorie en datumperiode. De dropdown-filters tonen enkel actieve opties; filteren op een optie matcht automatisch ook historische registraties met een gekoppelde inactieve entry. Medewerkers en beheerders kunnen hier ook registraties verwijderen (wissen) bij invoerfouten.</w:t>
       </w:r>
     </w:p>
     <w:p>
@@ -569,6 +569,11 @@
         <w:t>• Leeftijdscategorieën, Toestellen en Herkomst: kunnen enkel worden gewist als er geen geregistreerde consultaties aan gekoppeld zijn.</w:t>
         <w:br/>
         <w:t>Indien een item nog gekoppelde records heeft, is de verwijderknop automatisch uitgeschakeld met een verhelderende tooltip en het advies om het item te deactiveren in plaats van te wissen.</w:t>
+        <w:br/>
+        <w:br/>
+        <w:t>Mapping van historische en gedeactiveerde entries:</w:t>
+        <w:br/>
+        <w:t>Voor leeftijdscategorieën en toesteltypes kunnen gedeactiveerde items in het wijzigformulier worden gekoppeld (gemapt) naar een actieve categorie. Oude historische consultaties blijven behouden in de databank, maar worden in overzichten, filters, detailweergaven, statistieken en exports automatisch getoond en gegroepeerd onder de gemapte actieve categorie. In het beheeroverzicht toont een duidelijke badge 'Gemapt naar' de ingestelde koppeling.</w:t>
       </w:r>
     </w:p>
     <w:p>

</xml_diff>

<commit_message>
Voeg consultatielocatie filter en tabelkolom toe aan registraties; update documentatie en handleiding
</commit_message>
<xml_diff>
--- a/Digidokters_Gebruikershandleiding.docx
+++ b/Digidokters_Gebruikershandleiding.docx
@@ -295,7 +295,7 @@
     <w:p>
       <w:pPr/>
       <w:r>
-        <w:t>Het menu-item 'Registraties' toont een overzicht van alle geregistreerde consultaties: datum, bezoeker, digidokter, nieuwe bezoeker (ja/nee), herkomst, onderwerp, leeftijdscategorie en toestel. U kan de lijst doorzoeken en uitgebreid filteren op digidokter, toesteltype, geslacht, leeftijdscategorie en datumperiode. De dropdown-filters tonen enkel actieve opties; filteren op een optie matcht automatisch ook historische registraties met een gekoppelde inactieve entry. Medewerkers en beheerders kunnen hier ook registraties verwijderen (wissen) bij invoerfouten.</w:t>
+        <w:t>Het menu-item 'Registraties' toont een overzicht van alle geregistreerde consultaties: datum, bezoeker, locatie, digidokter, nieuwe bezoeker (ja/nee), herkomst, onderwerp, leeftijdscategorie en toestel. U kan de lijst doorzoeken en uitgebreid filteren op digidokter, locatie, toesteltype, geslacht, leeftijdscategorie en datumperiode. De tabel kan bovendien op elke kolom (zoals datum, bezoeker of locatie) oplopend of aflopend worden gesorteerd. De dropdown-filters tonen enkel actieve opties; filteren op een optie matcht automatisch ook historische registraties met een gekoppelde inactieve entry. Medewerkers en beheerders kunnen hier ook registraties verwijderen (wissen) bij invoerfouten.</w:t>
       </w:r>
     </w:p>
     <w:p>
@@ -309,7 +309,7 @@
     <w:p>
       <w:pPr/>
       <w:r>
-        <w:t>Klik in het menu op 'Nieuw bezoek' om een nieuwe registratie toe te voegen. De app selecteert automatisch uw eigen naam als standaard Digidokter, wat extra invoertijd bespaart. Vul de gevraagde gegevens in (datum, naam van de bezoeker, of het om een nieuwe bezoeker gaat, digidokter, herkomst, leeftijdscategorie, toestel en een korte functionele omschrijving van de hulpvraag) en klik op 'Opslaan'. Na het opslaan start de applicatie op de achtergrond automatisch een analyse via Gemini AI, die de hulpvraag indeelt in de passende categorie ten behoeve van de statistieken.</w:t>
+        <w:t>Klik in het menu op 'Nieuw bezoek' om een nieuwe registratie toe te voegen. De app selecteert automatisch uw eigen naam als standaard Digidokter, wat extra invoertijd bespaart. Indien uw organisatie meerdere actieve consultatielocaties heeft, kiest u ook de passende 'Locatie' (bij 1 actieve consultatielocatie wordt deze automatisch toegekend). Vul de overige gegevens in (datum, naam van de bezoeker, of het om een nieuwe bezoeker gaat, digidokter, herkomst, leeftijdscategorie, toestel en een korte functionele omschrijving van de hulpvraag) en klik op 'Opslaan'. Na het opslaan start de applicatie op de achtergrond automatisch een analyse via Gemini AI, die de hulpvraag indeelt in de passende categorie ten behoeve van de statistieken.</w:t>
       </w:r>
     </w:p>
     <w:p>
@@ -349,16 +349,11 @@
       <w:r>
         <w:t>Onder 'Statistieken' vindt u gedetailleerde overzichten, KPI's en grafieken verdeeld over drie gespecialiseerde tabbladen:</w:t>
         <w:br/>
-        <w:t>• Tab 1: Bezoekers &amp; Consultaties: Totaal aantal consultaties, verdeling nieuwe versus terugkerende bezoekers, leeftijdscategorieën, toestellen, herkomstkanalen, geslachtsverdeling en wekelijkse bezoekerstrends.</w:t>
+        <w:t>• Tab 1: Bezoekers &amp; Consultaties: Totaal aantal consultaties, verdeling nieuwe versus terugkerende bezoekers, verdeling over consultatielocaties, leeftijdscategorieën, toestellen, herkomstkanalen, geslachtsverdeling en wekelijkse bezoekerstrends.</w:t>
         <w:br/>
         <w:t>• Tab 2: Vrijwilligers &amp; Agenda: Totaal aantal gepresteerde uren door digidokters, maandelijkse inzet-trends, sessies per locatie en activiteitstype, en de bezoeker/vrijwilliger-ratio (druktest). Deze ratio houdt uitsluitend rekening met voorbije sessies.</w:t>
         <w:br/>
         <w:t>• Tab 3: Vragen &amp; AI-Analyse: Diepgaande analyse van de geregistreerde hulpvragen via Gemini AI. Toont de dekkingsgraad (percentage geanalyseerd), de meest voorkomende vraagcategorie, gemiddelde betrouwbaarheidsscore, een categorie-staafdiagram, een maandelijkse evolutiegrafiek van de top-5 categorieën, en kruistabellen met de populairste toestellen en leeftijdsgroepen per vraagcategorie.</w:t>
-        <w:br/>
-        <w:br/>
-        <w:t>Jaarfilter &amp; 'Alle jaren':</w:t>
-        <w:br/>
-        <w:t>Bovenaan de statistiekenpagina kunt u snel filteren op een specifiek kalenderjaar of kiezen voor 'Alle jaren' om de cumulatieve werking over de volledige looptijd te analyseren. Bij het wisselen van jaartal blijft het momenteel geopende tabblad automatisch actief.</w:t>
       </w:r>
     </w:p>
     <w:p>
@@ -555,14 +550,18 @@
     <w:p>
       <w:pPr/>
       <w:r>
-        <w:t>Onder 'Beheer' vindt u pagina's voor 'Digidokters', 'Activiteitstypes', 'Locaties', 'Leeftijdscategorieën', 'Toestellen' en 'Herkomst'. Hier kunt u opties toevoegen, wijzigen, deactiveren of definitief wissen. Met de pijltjes-knoppen kunt u de weergavevolgorde in de formulieren aanpassen. Voor 'Activiteitstypes' kunt u bovendien de status 'Actief' wijzigen, een specifieke kleur selecteren voor de badge in de agenda (Blauw, Teal, Paars, Oranje), en aanduiden of een 'Evaluatieformulier gewenst' is (standaard ingeschakeld voor Digicafé). In het overzichtsscherm ziet u een live gekleurde preview van de badge en een directe knop 'Configureren' om het evaluatieformulier te beheren.</w:t>
+        <w:t>Onder 'Beheer' vindt u pagina's voor 'Digidokters', 'Activiteitstypes', 'Locaties', 'Leeftijdscategorieën', 'Toestellen' en 'Herkomst'. Hier kunt u opties toevoegen, wijzigen, deactiveren of definitief wissen. Met de pijltjes-knoppen kunt u de weergavevolgorde in de formulieren aanpassen.</w:t>
+        <w:br/>
+        <w:t>Voor 'Locaties' kunt u aanduiden of een locatie 'Gebruikt voor consultaties' wordt. Alleen locaties met dit vinkje verschijnen bij de registratie van consultaties en in het consultatielocatiefilter.</w:t>
+        <w:br/>
+        <w:t>Voor 'Activiteitstypes' kunt u bovendien de status 'Actief' wijzigen, een specifieke kleur selecteren voor de badge in de agenda (Blauw, Teal, Paars, Oranje), en aanduiden of een 'Evaluatieformulier gewenst' is (standaard ingeschakeld voor Digicafé). In het overzichtsscherm ziet u een live gekleurde preview van de badge en een directe knop 'Configureren' om het evaluatieformulier te beheren.</w:t>
         <w:br/>
         <w:br/>
         <w:t>Stamgegevens wissen &amp; referentiecontroles:</w:t>
         <w:br/>
         <w:t>Het definitief wissen van stamgegevens is enkel toegestaan voor beheerders en platformbeheerders, en uitsluitend wanneer er géén andere gegevens naar verwijzen:</w:t>
         <w:br/>
-        <w:t>• Locaties: kunnen enkel worden gewist als er geen gekoppelde agenda-activiteiten aan verbonden zijn.</w:t>
+        <w:t>• Locaties: kunnen enkel worden gewist als er geen gekoppelde agenda-activiteiten of geregistreerde consultaties aan verbonden zijn.</w:t>
         <w:br/>
         <w:t>• Activiteitstypes: kunnen enkel worden gewist als er geen gekoppelde agenda-activiteiten of ingevulde evaluaties aan verbonden zijn (een leeg evaluatieformulier zonder reacties wordt automatisch mee opgeruimd).</w:t>
         <w:br/>

</xml_diff>

<commit_message>
Voeg Functies, Genderidentiteit, Profiel-zelfbediening en Sjabloon-beperkingen toe; documentatie bijgewerkt
</commit_message>
<xml_diff>
--- a/Digidokters_Gebruikershandleiding.docx
+++ b/Digidokters_Gebruikershandleiding.docx
@@ -295,7 +295,7 @@
     <w:p>
       <w:pPr/>
       <w:r>
-        <w:t>Het menu-item 'Registraties' toont een overzicht van alle geregistreerde consultaties: datum, bezoeker, locatie, digidokter, nieuwe bezoeker (ja/nee), herkomst, onderwerp, leeftijdscategorie en toestel. U kan de lijst doorzoeken en uitgebreid filteren op digidokter, locatie, toesteltype, geslacht, leeftijdscategorie en datumperiode. De tabel kan bovendien op elke kolom (zoals datum, bezoeker of locatie) oplopend of aflopend worden gesorteerd. De dropdown-filters tonen enkel actieve opties; filteren op een optie matcht automatisch ook historische registraties met een gekoppelde inactieve entry. Medewerkers en beheerders kunnen hier ook registraties verwijderen (wissen) bij invoerfouten.</w:t>
+        <w:t>Het menu-item 'Registraties' toont een overzicht van alle geregistreerde consultaties: datum, bezoeker, digidokter, nieuwe bezoeker (ja/nee), herkomst, geslacht/gender, onderwerp, leeftijdscategorie en toestel. U kan de lijst doorzoeken en filteren. Medewerkers en beheerders kunnen hier ook registraties verwijderen (wissen) bij invoerfouten.</w:t>
       </w:r>
     </w:p>
     <w:p>
@@ -309,7 +309,7 @@
     <w:p>
       <w:pPr/>
       <w:r>
-        <w:t>Klik in het menu op 'Nieuw bezoek' om een nieuwe registratie toe te voegen. De app selecteert automatisch uw eigen naam als standaard Digidokter, wat extra invoertijd bespaart. Indien uw organisatie meerdere actieve consultatielocaties heeft, kiest u ook de passende 'Locatie' (bij 1 actieve consultatielocatie wordt deze automatisch toegekend). Vul de overige gegevens in (datum, naam van de bezoeker, of het om een nieuwe bezoeker gaat, digidokter, herkomst, leeftijdscategorie, toestel en een korte functionele omschrijving van de hulpvraag) en klik op 'Opslaan'. Na het opslaan start de applicatie op de achtergrond automatisch een analyse via Gemini AI, die de hulpvraag indeelt in de passende categorie ten behoeve van de statistieken.</w:t>
+        <w:t>Klik in het menu op 'Nieuw bezoek' om een nieuwe registratie toe te voegen. De app selecteert automatisch uw eigen naam als standaard Digidokter, wat extra invoertijd bespaart. Vul de gevraagde gegevens in (datum, naam van de bezoeker, of het om een nieuwe bezoeker gaat, digidokter, herkomst, geslacht/genderidentiteit, leeftijdscategorie, toestel en een korte functionele omschrijving van de hulpvraag) en klik op 'Opslaan'. Na het opslaan start de applicatie op de achtergrond automatisch een analyse via Gemini AI, die de hulpvraag indeelt in de passende categorie ten behoeve van de statistieken.</w:t>
       </w:r>
     </w:p>
     <w:p>
@@ -513,6 +513,29 @@
     </w:p>
     <w:p>
       <w:pPr>
+        <w:pStyle w:val="Heading2"/>
+      </w:pPr>
+      <w:r>
+        <w:t>3.11 Profielbeheer &amp; Eigen functies instellen (Zelfbediening)</w:t>
+      </w:r>
+    </w:p>
+    <w:p>
+      <w:pPr/>
+      <w:r>
+        <w:t>Elke aangemelde gebruiker kan te allen tijde zijn eigen profielgegevens bekijken en bijwerken door in de linkeronderhoek op zijn/haar gebruikersnaam te klikken:</w:t>
+        <w:br/>
+        <w:t>• Eigen functies kiezen: U kunt zelf eenvoudig selectievakjes aan- of uitvinken voor de functies die u opneemt binnen de huidige organisatie (bijv. Digidokter, Digihelper, Lesgever).</w:t>
+        <w:br/>
+        <w:t>• Contactgegevens bijwerken: U kunt zelf uw e-mailadres en mobiele telefoonnummer aanpassen voor interne communicatie.</w:t>
+        <w:br/>
+        <w:t>• Wachtwoord wijzigen: U kunt uw wachtwoord op elk gewenst moment veilig vernieuwen.</w:t>
+      </w:r>
+    </w:p>
+    <w:p>
+      <w:pPr/>
+    </w:p>
+    <w:p>
+      <w:pPr>
         <w:pStyle w:val="Heading1"/>
       </w:pPr>
       <w:r>
@@ -536,7 +559,7 @@
     <w:p>
       <w:pPr/>
       <w:r>
-        <w:t>Via 'Beheer &gt; Gebruikers' kunt u de medewerkers en beheerders van uw organisatie beheren. Elk account vereist een uniek e-mailadres waarmee de gebruiker kan inloggen. U kunt nieuwe gebruikers aanmaken, hun gegevens of rol wijzigen, hun actieve status in- of uitschakelen, en de tabel op elke kolom sorteren. Gebruikers op wier naam nog geen registraties staan kunnen hier ook definitief verwijderd worden. Alleen platformbeheerders kunnen de rol 'platformbeheerder' toekennen.</w:t>
+        <w:t>Via 'Beheer &gt; Gebruikers' kunt u de medewerkers en beheerders van uw organisatie beheren. U kunt nieuwe accounts aanmaken, wachtwoorden resetten, rollen toekennen (Lezer, Medewerker, Beheerder), het telefoonnummer van de medewerker noteren en één of meerdere functies toekennen (zoals Digidokter, Digihelper, Lesgever).</w:t>
       </w:r>
     </w:p>
     <w:p>
@@ -550,29 +573,7 @@
     <w:p>
       <w:pPr/>
       <w:r>
-        <w:t>Onder 'Beheer' vindt u pagina's voor 'Digidokters', 'Activiteitstypes', 'Locaties', 'Leeftijdscategorieën', 'Toestellen' en 'Herkomst'. Hier kunt u opties toevoegen, wijzigen, deactiveren of definitief wissen. Met de pijltjes-knoppen kunt u de weergavevolgorde in de formulieren aanpassen.</w:t>
-        <w:br/>
-        <w:t>Voor 'Locaties' kunt u aanduiden of een locatie 'Gebruikt voor consultaties' wordt. Alleen locaties met dit vinkje verschijnen bij de registratie van consultaties en in het consultatielocatiefilter.</w:t>
-        <w:br/>
-        <w:t>Voor 'Activiteitstypes' kunt u bovendien de status 'Actief' wijzigen, een specifieke kleur selecteren voor de badge in de agenda (Blauw, Teal, Paars, Oranje), en aanduiden of een 'Evaluatieformulier gewenst' is (standaard ingeschakeld voor Digicafé). In het overzichtsscherm ziet u een live gekleurde preview van de badge en een directe knop 'Configureren' om het evaluatieformulier te beheren.</w:t>
-        <w:br/>
-        <w:br/>
-        <w:t>Stamgegevens wissen &amp; referentiecontroles:</w:t>
-        <w:br/>
-        <w:t>Het definitief wissen van stamgegevens is enkel toegestaan voor beheerders en platformbeheerders, en uitsluitend wanneer er géén andere gegevens naar verwijzen:</w:t>
-        <w:br/>
-        <w:t>• Locaties: kunnen enkel worden gewist als er geen gekoppelde agenda-activiteiten of geregistreerde consultaties aan verbonden zijn.</w:t>
-        <w:br/>
-        <w:t>• Activiteitstypes: kunnen enkel worden gewist als er geen gekoppelde agenda-activiteiten of ingevulde evaluaties aan verbonden zijn (een leeg evaluatieformulier zonder reacties wordt automatisch mee opgeruimd).</w:t>
-        <w:br/>
-        <w:t>• Leeftijdscategorieën, Toestellen en Herkomst: kunnen enkel worden gewist als er geen geregistreerde consultaties aan gekoppeld zijn.</w:t>
-        <w:br/>
-        <w:t>Indien een item nog gekoppelde records heeft, is de verwijderknop automatisch uitgeschakeld met een verhelderende tooltip en het advies om het item te deactiveren in plaats van te wissen.</w:t>
-        <w:br/>
-        <w:br/>
-        <w:t>Mapping van historische en gedeactiveerde entries:</w:t>
-        <w:br/>
-        <w:t>Voor leeftijdscategorieën en toesteltypes kunnen gedeactiveerde items in het wijzigformulier worden gekoppeld (gemapt) naar een actieve categorie. Oude historische consultaties blijven behouden in de databank, maar worden in overzichten, filters, detailweergaven, statistieken en exports automatisch getoond en gegroepeerd onder de gemapte actieve categorie. In het beheeroverzicht toont een duidelijke badge 'Gemapt naar' de ingestelde koppeling.</w:t>
+        <w:t>Onder 'Beheer' vindt u pagina's voor 'Digidokters', 'Activiteitstypes', 'Locaties', 'Leeftijdscategorieën', 'Toestellen', 'Herkomst', 'Genderidentiteiten' en 'Functies'. Beheerders kunnen keuzelijsten aanpassen, activeren/deactiveren, de volgorde wijzigen en ongebruikte items veilig wissen.</w:t>
       </w:r>
     </w:p>
     <w:p>
@@ -679,6 +680,10 @@
         <w:t>• Vraagclassificaties opvolgen &amp; overriden: Onder 'Platformbeheer &gt; Vraagclassificaties' vindt u het centrale monitoringoverzicht van alle geanalyseerde vragen. Met visuele kleurcodes (groen, oranje, rood) ziet u de betrouwbaarheid van de AI. U kunt handmatig categorieën corrigeren (waarbij 'Handmatig aangepast' wordt geregistreerd), met één klik een vraag opnieuw door Gemini laten analyseren, of een batch-analyse starten op resterende vragen.</w:t>
         <w:br/>
         <w:t>• Centraal beheer van App documentatie: Platformbeheerders hebben exclusieve schrijfrechten om binnen 'App documentatie' centrale mappen en bestanden te uploaden, bewerken, overschrijven (versiebeheer) of wissen voor het gehele platform.</w:t>
+        <w:br/>
+        <w:t>• Vraagclassificaties &amp; Asynchrone Batch-analyse: Onder 'Platformbeheer &gt; Vraagclassificaties' kunnen platformbeheerders met één klik een batch-analyse starten. Deze analyse draait asynchroon in de achtergrond met een realtime voortgangsindicator, zodat de applicatie vlot en direct bruikbaar blijft.</w:t>
+        <w:br/>
+        <w:t>• Centrale Sjabloon-organisatie ('Sjabloon'): De organisatie 'Sjabloon' dient uitsluitend als referentie-blauwdruk voor stamgegevens. Transacties (registraties, agenda, documenten) zijn hierin uitgeschakeld om het standaardsjabloon zuiver te houden.</w:t>
       </w:r>
     </w:p>
     <w:p>

</xml_diff>

<commit_message>
Documentatie bijgewerkt: balie-registratieformulier, vraagclassificatie-popups en statusfilters
</commit_message>
<xml_diff>
--- a/Digidokters_Gebruikershandleiding.docx
+++ b/Digidokters_Gebruikershandleiding.docx
@@ -295,7 +295,7 @@
     <w:p>
       <w:pPr/>
       <w:r>
-        <w:t>Het menu-item 'Registraties' toont een overzicht van alle geregistreerde consultaties: datum, bezoeker, digidokter, nieuwe bezoeker (ja/nee), herkomst, geslacht/gender, onderwerp, leeftijdscategorie en toestel. U kan de lijst doorzoeken en filteren. Medewerkers en beheerders kunnen hier ook registraties verwijderen (wissen) bij invoerfouten.</w:t>
+        <w:t>Het menu-item 'Registraties' toont een overzicht van alle geregistreerde consultaties: datum, bezoeker, digidokter, nieuwe bezoeker (ja/nee), herkomst, geslacht/gender, onderwerp, leeftijdscategorie en toestel. U kan de lijst doorzoeken en filteren. Klik op een registratie om de detailweergave te openen, inclusief de automatische AI-vraagclassificatie (toegewezen categorie, betrouwbaarheidsscore en motivatie van het taalmodel). Medewerkers en beheerders kunnen hier ook registraties verwijderen (wissen) bij invoerfouten.</w:t>
       </w:r>
     </w:p>
     <w:p>
@@ -309,7 +309,15 @@
     <w:p>
       <w:pPr/>
       <w:r>
-        <w:t>Klik in het menu op 'Nieuw bezoek' om een nieuwe registratie toe te voegen. De app selecteert automatisch uw eigen naam als standaard Digidokter, wat extra invoertijd bespaart. Vul de gevraagde gegevens in (datum, naam van de bezoeker, of het om een nieuwe bezoeker gaat, digidokter, herkomst, geslacht/genderidentiteit, leeftijdscategorie, toestel en een korte functionele omschrijving van de hulpvraag) en klik op 'Opslaan'. Na het opslaan start de applicatie op de achtergrond automatisch een analyse via Gemini AI, die de hulpvraag indeelt in de passende categorie ten behoeve van de statistieken.</w:t>
+        <w:t>Klik in het menu op 'Nieuw bezoek' om een nieuwe consultatie te registreren. Dit formulier is speciaal ontworpen voor touchscreens, tablets en drukke inloopmomenten:</w:t>
+        <w:br/>
+        <w:t>• Sessie-context (bovenaan): De datum, actieve Digidokter en consultatielocatie blijven gedurende uw sessie automatisch bewaard en geselecteerd.</w:t>
+        <w:br/>
+        <w:t>• Touch-chips &amp; grote selectieknoppen: Duidelijke knoppen voor 'Nieuwe bezoeker (Ja/Nee)', geslacht, leeftijdscategorie en toesteltype.</w:t>
+        <w:br/>
+        <w:t>• Snelle tag-knoppen: Klik met één tik op populaire thema's zoals itsme, WhatsApp, E-mail, Smartschool of Wifi om het onderwerp direct in te vullen.</w:t>
+        <w:br/>
+        <w:t>• Opslaan &amp; Volgende bezoeker: Eén grote knop slaat het bezoek direct op en zet het formulier meteen klaar voor de volgende bezoeker. Op de achtergrond start automatisch een asynchrone AI-analyse (Gemini) om de vraag in te delen in de passende categorie voor statistieken.</w:t>
       </w:r>
     </w:p>
     <w:p>
@@ -573,7 +581,7 @@
     <w:p>
       <w:pPr/>
       <w:r>
-        <w:t>Onder 'Beheer' vindt u pagina's voor 'Digidokters', 'Activiteitstypes', 'Locaties', 'Leeftijdscategorieën', 'Toestellen', 'Herkomst', 'Genderidentiteiten' en 'Functies'. Beheerders kunnen keuzelijsten aanpassen, activeren/deactiveren, de volgorde wijzigen en ongebruikte items veilig wissen.</w:t>
+        <w:t>Onder 'Beheer' vindt u pagina's voor 'Digidokters', 'Activiteitstypes', 'Locaties', 'Leeftijdscategorieën', 'Toestellen', 'Herkomst', 'Genderidentiteiten' en 'Functies'. Beheerders kunnen keuzelijsten aanpassen, activeren/deactiveren, de volgorde wijzigen en ongebruikte items veilig wissen. Op elke stamgegevenspagina is tevens een statusfilter aanwezig (Alle items, Enkel actieve items, Enkel gedeactiveerde items).</w:t>
       </w:r>
     </w:p>
     <w:p>
@@ -641,47 +649,9 @@
     <w:p>
       <w:pPr/>
       <w:r>
-        <w:t>Gebruikers met de rol 'platformbeheerder' hebben toegang tot het menu 'Platformbeheer':</w:t>
+        <w:t>• Aanpasbare e-mailsjablonen: Via 'Platformbeheer &gt; E-mailsjablonen' kunnen de standaardsjablonen voor uitnodigingen en herinneringen worden bewerkt met dynamische tags en een live preview.</w:t>
         <w:br/>
-        <w:t>• Organisaties toevoegen &amp; bewerken: Nieuwe organisaties kunnen worden aangemaakt. Bij aanmaak worden alle actieve stamgegevens automatisch als blauwdruk gekopieerd uit de 'Sjabloon'-organisatie.</w:t>
-        <w:br/>
-        <w:t>• Centrale Sjabloon-organisatie: De speciale organisatie 'Sjabloon' (slug: sjabloon) fungeert als referentiemodel voor het hele platform. Alle actieve stamgegevens (leeftijdscategorieën, toestellen, activiteitstypes, Digicafé evaluatieformulier en vragen, locaties en herkomsten) die hierin staan, vormen de standaard voor nieuwe organisaties. Pas je als platformbeheerder de stamgegevens van 'Sjabloon' aan, dan nemen toekomstige organisaties automatisch die nieuwe standaarden over.</w:t>
-        <w:br/>
-        <w:t>• Exclusieve toegang tot Sjabloon: Uitsluitend platformbeheerders kunnen overschakelen naar de 'Sjabloon'-organisatie. Reguliere gebruikers (beheerders, medewerkers, lezers) hebben geen toegang tot deze tenant en kunnen er niet aan gekoppeld worden.</w:t>
-        <w:br/>
-        <w:t>• Organisaties activeren / deactiveren: Met het slot-icoontje kan een organisatie tijdelijk worden gedeactiveerd om aanmeldingen te blokkeren.</w:t>
-        <w:br/>
-        <w:t>• Organisaties wissen (definitief): Via het rode vuilnisbak-icoontje kan een overbodige organisatie definitief worden gewist. Dit verwijdert ALLE geassocieerde data onomkeerbaar: registraties, agenda-activiteiten, evaluatieformulieren &amp; reacties, documenten, mappen, stamgegevens en gebruikerskoppelingen. Zowel de hoofdorganisatie (ID 1) als de Sjabloon-organisatie zijn beschermd en kunnen nooit gewist worden.</w:t>
-        <w:br/>
-        <w:t>• Gebruikers koppelen: Platformbeheerders kunnen gebruikers toewijzen aan specifieke organisaties met de gewenste rol ('beheerder', 'medewerker' of 'lezer').</w:t>
-        <w:br/>
-        <w:t>• Globaal platformdashboard: Een geaggregeerd dashboard dat realtime statistieken over alle aangesloten gemeenten en organisaties heen toont. Het dashboard toont:</w:t>
-        <w:br/>
-        <w:t xml:space="preserve">  - Totaal aantal consultaties (bezoeken) over het gehele platformnetwerk.</w:t>
-        <w:br/>
-        <w:t xml:space="preserve">  - Aantal actieve vrijwilligers (Digidokters), inclusief telling van unieke personen.</w:t>
-        <w:br/>
-        <w:t xml:space="preserve">  - Spreiding over gemeenten met interactieve visualisaties (staafgrafiek van consultaties per gemeente en doughnutgrafiek van de vrijwilligersverdeling).</w:t>
-        <w:br/>
-        <w:t xml:space="preserve">  - Een gedetailleerde spreidingstabel met het procentueel aandeel van elke gemeente (met visuele voortgangsbalken), aantal sessies en gekoppelde gebruikers.</w:t>
-        <w:br/>
-        <w:t xml:space="preserve">  - Een periodefilter om de data per kalenderjaar of over alle jaren heen te analyseren.</w:t>
-        <w:br/>
-        <w:t>• Aanpasbare e-mailsjablonen: Via 'Platformbeheer &gt; E-mailsjablonen' kunnen platformbeheerders de standaardteksten en onderwerpen van de uitnodigings- en herinneringsmails beheren:</w:t>
-        <w:br/>
-        <w:t xml:space="preserve">  - Dynamische placeholders ({naam}, {activiteit}, {datum}, {uur_van}, {uur_tot}, {locatie}, {omschrijving_blok}, {link}) met klikbare badges om ze direct in de tekst in te voegen.</w:t>
-        <w:br/>
-        <w:t xml:space="preserve">  - Real-time live previewpaneel dat de e-mail met realistische voorbeelddata direct toont tijdens het typen.</w:t>
-        <w:br/>
-        <w:t xml:space="preserve">  - Fabrieksherstel via de knop 'Herstel naar standaard' om een sjabloon te allen tijde terug te zetten naar de originele standaardtekst.</w:t>
-        <w:br/>
-        <w:t>• Vraagcategorieën beheren: Onder 'Platformbeheer &gt; Vraagcategorieën' beheert de platformbeheerder de centrale stamgegevens voor de AI-analyse (toevoegen, wijzigen, omschrijving/richtlijnen voor Gemini AI aanpassen, volgorde wijzigen en in-/uitschakelen). Deze categorieën zijn gemeenschappelijk voor alle gemeenten.</w:t>
-        <w:br/>
-        <w:t>• Vraagclassificaties opvolgen &amp; overriden: Onder 'Platformbeheer &gt; Vraagclassificaties' vindt u het centrale monitoringoverzicht van alle geanalyseerde vragen. Met visuele kleurcodes (groen, oranje, rood) ziet u de betrouwbaarheid van de AI. U kunt handmatig categorieën corrigeren (waarbij 'Handmatig aangepast' wordt geregistreerd), met één klik een vraag opnieuw door Gemini laten analyseren, of een batch-analyse starten op resterende vragen.</w:t>
-        <w:br/>
-        <w:t>• Centraal beheer van App documentatie: Platformbeheerders hebben exclusieve schrijfrechten om binnen 'App documentatie' centrale mappen en bestanden te uploaden, bewerken, overschrijven (versiebeheer) of wissen voor het gehele platform.</w:t>
-        <w:br/>
-        <w:t>• Vraagclassificaties &amp; Asynchrone Batch-analyse: Onder 'Platformbeheer &gt; Vraagclassificaties' kunnen platformbeheerders met één klik een batch-analyse starten. Deze analyse draait asynchroon in de achtergrond met een realtime voortgangsindicator, zodat de applicatie vlot en direct bruikbaar blijft.</w:t>
+        <w:t>• Vraagclassificaties &amp; Detail-popups: Onder 'Platformbeheer &gt; Vraagclassificaties' kunnen alle AI-classificaties worden gemonitord en handmatig gecorrigeerd. Klik op een rij om direct een popup-venster met alle details van de registratie te openen. Met de knop 'Batch-analyse starten' kunnen alle ongeclassificeerde vragen asynchroon op de achtergrond worden geanalyseerd met een realtime voortgangsbalk.</w:t>
         <w:br/>
         <w:t>• Centrale Sjabloon-organisatie ('Sjabloon'): De organisatie 'Sjabloon' dient uitsluitend als referentie-blauwdruk voor stamgegevens. Transacties (registraties, agenda, documenten) zijn hierin uitgeschakeld om het standaardsjabloon zuiver te houden.</w:t>
       </w:r>

</xml_diff>

<commit_message>
Voeg mogelijkheid toe om evaluatieformulieren direct via de app in te vullen met notificatiebadges en documentatie
</commit_message>
<xml_diff>
--- a/Digidokters_Gebruikershandleiding.docx
+++ b/Digidokters_Gebruikershandleiding.docx
@@ -378,7 +378,7 @@
     <w:p>
       <w:pPr/>
       <w:r>
-        <w:t>Via het menu-item 'Agenda' kan u geplande activiteiten bekijken, filteren op datum, type, locatie en digidokter, en sorteren op elke kolom. Medewerkers en beheerders kunnen hier ook nieuwe eenmalige of terugkerende activiteiten inplannen, bewerken of verwijderen. Bij het registreren of wijzigen van een activiteit kan u selecteren welke (actieve) digidokters aanwezig zullen zijn.</w:t>
+        <w:t>Via het menu-item 'Agenda' kan u geplande activiteiten bekijken, filteren op datum, type, locatie en digidokter, en sorteren op alle kolommen. Indien u als digidokter aanwezig was bij afgelopen activiteiten met evaluatieplicht waarvoor u nog geen evaluatie heeft ingediend, toont de Agenda bovenaan een handige attentiebanner en kunt u het formulier via de gele knop 'Evaluatie invullen' direct openen en afronden.</w:t>
       </w:r>
     </w:p>
     <w:p>
@@ -418,15 +418,21 @@
     <w:p>
       <w:pPr/>
       <w:r>
-        <w:t>Voor bepaalde activiteiten (zoals Digicafés) wordt na afloop gevraagd om een korte evaluatie in te vullen.</w:t>
+        <w:t>Voor bepaalde activiteiten (zoals Digicafés) wordt na afloop gevraagd om een korte evaluatie in te vullen:</w:t>
         <w:br/>
         <w:t>• Uitnodiging via e-mail: Aanwezige digidokters die in de agenda aan de activiteit zijn gekoppeld, ontvangen na afloop van de sessie automatisch een e-mail met een directe, beveiligde link om het formulier in te vullen (inloggen is via deze link niet vereist).</w:t>
         <w:br/>
-        <w:t>• Invullen via de Agenda: Ingelogde medewerkers en digidokters kunnen het formulier ook direct openen door in de Agenda te klikken op het blauwe icoontje of de badge 'Evaluatie' bij de betreffende activiteit.</w:t>
+        <w:t>• Later invullen via de App: Digidokters en medewerkers kunnen hun formulieren op elk moment via de applicatie invullen:</w:t>
         <w:br/>
-        <w:t>• Het formulier: De vragenlijst bestaat uit meerkeuzevragen (met overzichtelijke keuzerondjes naast elkaar) en vrije tekstvelden voor opmerkingen of suggesties.</w:t>
+        <w:t xml:space="preserve">  - Attentiebanner &amp; Actieknoppen in de Agenda: Bovenaan de Agenda verschijnt een waarschuwingsbanner met het aantal openstaande evaluaties. In de lijst staat bij elke afgelopen activiteit waar u aanwezig was een gele knop 'Evaluatie invullen'.</w:t>
         <w:br/>
-        <w:t>• Registratie: Bij het verzenden registreert de app automatisch welke digidokter het formulier heeft ingevuld en op welk tijdstip. Reeds ingevulde formulieren kunnen niet dubbel worden ingestuurd.</w:t>
+        <w:t xml:space="preserve">  - Notificatiebadge in het Menu: Naast het menu-item 'Evaluaties' toont een oranje badge het aantal nog in te vullen evaluaties voor de ingelogde gebruiker.</w:t>
+        <w:br/>
+        <w:t xml:space="preserve">  - Snelfilter op de Evaluatiepagina: Op de Evaluaties-pagina kunt u via de schakelaar 'Enkel mijn openstaande evaluaties' direct een lijst oproepen van de sessies die op uw feedback wachten.</w:t>
+        <w:br/>
+        <w:t>• Statusindicatie per activiteit: In de overzichten ziet u altijd de actuele status van een sessie ('Ingevuld', 'Nog invullen', 'Niet aanwezig' of 'Toekomstig').</w:t>
+        <w:br/>
+        <w:t>• Het formulier: De vragenlijst bestaat uit meerkeuzevragen (met overzichtelijke keuzerondjes naast elkaar) en vrije tekstvelden voor opmerkingen of suggesties. Uw profiel wordt automatisch herkend en reeds ingevulde formulieren kunnen niet dubbel worden ingestuurd.</w:t>
       </w:r>
     </w:p>
     <w:p>

</xml_diff>

<commit_message>
docs: gebruikershandleiding en README bijgewerkt voor document viewer
</commit_message>
<xml_diff>
--- a/Digidokters_Gebruikershandleiding.docx
+++ b/Digidokters_Gebruikershandleiding.docx
@@ -396,15 +396,15 @@
         <w:br/>
         <w:t>• Mappenstructuur: U kunt nieuwe mappen aanmaken, hernoemen of verwijderen om uw bestanden overzichtelijk in te delen (inclusief submappen).</w:t>
         <w:br/>
-        <w:t>• Documenten uploaden: U kunt bestanden uploaden (zoals PDF, Word, Excel, afbeeldingen). De maximale bestandsgrootte bedraagt 16 MB per bestand.</w:t>
+        <w:t>• Documenten uploaden: U kunt bestanden uploaden (zoals PDF, Word, OpenDocument, Excel, Markdown, afbeeldingen, tekst). De maximale bestandsgrootte bedraagt 16 MB per bestand.</w:t>
         <w:br/>
-        <w:t>• Bekijken &amp; Downloaden: Klik op het download-icoontje om een bestand op te slaan, of bekijk PDF- en afbeeldingsbestanden rechtstreeks in de browser via het oog-icoontje.</w:t>
+        <w:t>• In-Browser Document Viewer: Bekijk bestanden direct in de browser via het oog-icoontje. De rijke viewer ondersteunt Word (.docx, .docm), OpenDocument (.odt), Excel &amp; Spreadsheets (.xlsx, .xlsm, .csv, .tsv), Markdown (.md), PDF, afbeeldingen en broncode/tekstbestanden (.json, .xml, .log, etc.). Inclusief snelle knoppen om af te drukken, tekst te kopiëren of het originele bestand te downloaden.</w:t>
         <w:br/>
         <w:t>• Versiebeheer (overschrijven): Bij het uploaden van een nieuwe versie via de knop 'Nieuwe versie uploaden' wordt het document vervangen en wordt het versienummer automatisch opgehoogd (v1, v2, v3, ...).</w:t>
         <w:br/>
         <w:t>• Details bewerken &amp; verwijderen: U kunt de bestandsnaam en een optionele omschrijving bewerken of een document definitief verwijderen.</w:t>
         <w:br/>
-        <w:t>• Geavanceerd zoeken (inclusief inhoud): Via de zoekbalk bovenaan zoekt u gelijktijdig in mapnamen, bestandsnamen, omschrijvingen én in de volledige tekstinhoud van documenten (Word, PDF, Excel en tekstbestanden). Wanneer een zoekterm in de inhoud van een document wordt gevonden, toont de zoeklijst het label 'Gevonden in inhoud' met een citaat/fragment waarin de zoekterm voorkomt.</w:t>
+        <w:t>• Geavanceerd zoeken (inclusief inhoud): Via de zoekbalk bovenaan zoekt u gelijktijdig in mapnamen, bestandsnamen, omschrijvingen én in de volledige tekstinhoud van documenten (Word, OpenDocument, PDF, Excel en tekstbestanden). Wanneer een zoekterm in de inhoud van een document wordt gevonden, toont de zoeklijst het label 'Gevonden in inhoud' met een citaat/fragment waarin de zoekterm voorkomt.</w:t>
       </w:r>
     </w:p>
     <w:p>
@@ -498,7 +498,7 @@
         <w:br/>
         <w:t>• Doel &amp; Inhoud: Deze centrale bibliotheek bevat overkoepelende documenten die van belang zijn voor alle organisaties, zoals de gebruikershandleiding, GDPR- en security-auditverslagen, sjablonen en technische specificaties. Documenten hoeven hierdoor niet meer per gemeente afzonderlijk geüpload of geüpdatet te worden.</w:t>
         <w:br/>
-        <w:t>• Voor alle gebruikers: Iedereen (zowel lezers, medewerkers als beheerders van elke organisatie) kan de mappen openen, documenten downloaden, inline bekijken (PDF en afbeeldingen) en gebruikmaken van de ingebouwde zoekbalk inclusief tekstzoekindex.</w:t>
+        <w:t>• Voor alle gebruikers: Iedereen (zowel lezers, medewerkers als beheerders van elke organisatie) kan de mappen openen, documenten downloaden, direct in de browser bekijken via de ingebouwde documentviewer (Word, ODT, Excel, Markdown, PDF, afbeeldingen, tekst) en gebruikmaken van de ingebouwde zoekbalk inclusief tekstzoekindex.</w:t>
         <w:br/>
         <w:t>• Beheer door platformbeheerder: Om te vermijden dat centrale documenten per ongeluk worden gewijzigd of gewist, zijn upload-, hernoem-, versie-overschrijf- en verwijderacties exclusief voorbehouden aan de platformbeheerder.</w:t>
       </w:r>

</xml_diff>

<commit_message>
Implementeer dynamisch groepen- en permissiesysteem, export vraagclassificatie, audit rapporten en documentatie updates
</commit_message>
<xml_diff>
--- a/Digidokters_Gebruikershandleiding.docx
+++ b/Digidokters_Gebruikershandleiding.docx
@@ -249,7 +249,7 @@
     <w:p>
       <w:pPr/>
       <w:r>
-        <w:t>Bij de allereerste aanmelding met een tijdelijk wachtwoord vraagt de app u om onmiddellijk een nieuw, persoonlijk wachtwoord in te stellen. Dit wachtwoord moet minstens 8 tekens bevatten, met minstens één hoofdletter en één cijfer.</w:t>
+        <w:t>Bij de allereerste aanmelding met een door de beheerder aangemaakt tijdelijk wachtwoord vraagt de app u om onmiddellijk een nieuw, persoonlijk wachtwoord in te stellen. Uw actieve organisatie blijft hierbij automatisch bewaard, zodat u direct aan de slag kunt. Dit wachtwoord moet minstens 8 tekens bevatten, met minstens één hoofdletter en één cijfer.</w:t>
       </w:r>
     </w:p>
     <w:p>
@@ -296,6 +296,9 @@
       <w:pPr/>
       <w:r>
         <w:t>Het menu-item 'Registraties' toont een overzicht van alle geregistreerde consultaties: datum, bezoeker, digidokter, nieuwe bezoeker (ja/nee), herkomst, geslacht/gender, onderwerp, leeftijdscategorie en toestel. U kan de lijst doorzoeken en filteren. Klik op een registratie om de detailweergave te openen, inclusief de automatische AI-vraagclassificatie (toegewezen categorie, betrouwbaarheidsscore en motivatie van het taalmodel). Medewerkers en beheerders kunnen hier ook registraties verwijderen (wissen) bij invoerfouten.</w:t>
+        <w:br/>
+        <w:br/>
+        <w:t>Opmerking over de Digidokter-filter: Indien voor uw gebruikersgroep de restrictie 'Alleen eigen registraties tonen' is ingesteld, wordt het filterveld voor digidokters automatisch verborgen en krijgt u uitsluitend uw eigen geregistreerde consultaties te zien.</w:t>
       </w:r>
     </w:p>
     <w:p>
@@ -341,7 +344,7 @@
     <w:p>
       <w:pPr/>
       <w:r>
-        <w:t>Via 'Exporteren' kan u alle (of gefilterde) registraties downloaden als Excel- (.xlsx) of CSV-bestand. De gedownloade tabellen bevatten gestandaardiseerde kolomkoppen (waaronder 'Bezoeker' en 'Nieuwe bezoeker') voor eenvoudige verwerking in externe rapporten.</w:t>
+        <w:t>Via 'Exporteren' kan u alle (of gefilterde) registraties downloaden als Excel- (.xlsx) of CSV-bestand. De gedownloade tabellen bevatten gestandaardiseerde kolomkoppen (waaronder 'Bezoeker', 'Nieuwe bezoeker' en de automatische AI-'Vraagclassificatie') voor eenvoudige verwerking en verdere analyse in externe rapporten.</w:t>
       </w:r>
     </w:p>
     <w:p>
@@ -573,7 +576,7 @@
     <w:p>
       <w:pPr/>
       <w:r>
-        <w:t>Via 'Beheer &gt; Gebruikers' kunt u de medewerkers en beheerders van uw organisatie beheren. U kunt nieuwe accounts aanmaken, wachtwoorden resetten, rollen toekennen (Lezer, Medewerker, Beheerder), het telefoonnummer van de medewerker noteren en één of meerdere functies toekennen (zoals Digidokter, Digihelper, Lesgever).</w:t>
+        <w:t>Via 'Beheer &gt; Gebruikers' kunt u de medewerkers en beheerders van uw organisatie beheren. U kunt nieuwe accounts aanmaken met een tijdelijk wachtwoord, wachtwoorden resetten, rollen en functies toekennen (zoals Digidokter, Digihelper, Lesgever), het telefoonnummer noteren en gebruikers toewijzen aan één of meerdere autorisatiegroepen van uw organisatie. Wanneer een gebruiker tot meerdere groepen behoort, worden de toegekende rechten gecombineerd volgens het principe 'hoogste recht telt'.</w:t>
       </w:r>
     </w:p>
     <w:p>
@@ -581,7 +584,34 @@
         <w:pStyle w:val="Heading2"/>
       </w:pPr>
       <w:r>
-        <w:t>4.2 Stamgegevens beheren</w:t>
+        <w:t>4.2 Groepen &amp; Autorisatiebeheer (Permissiematrix)</w:t>
+      </w:r>
+    </w:p>
+    <w:p>
+      <w:pPr/>
+      <w:r>
+        <w:t>Via 'Beheer &gt; Groepen' kunnen lokale beheerders het autorisatieschema van hun organisatie volledig op maat configureren:</w:t>
+        <w:br/>
+        <w:t>• Fijnmazige Permissiematrix: Voor elke groep kan per functionele module (Registraties, Agenda, Evaluaties, Documenten, Statistieken, Export, Feedback, Stamgegevens, Gebruikers, Groepen, Backups, Auditlogs, App documentatie) het recht worden ingesteld op 'Geen toegang', 'Alleen lezen' of 'Lezen en schrijven'.</w:t>
+        <w:br/>
+        <w:t>• Snelknoppen (Presets): Gebruik de knoppen 'Stel in als Lezer', 'Stel in als Medewerker' of 'Stel in als Beheerder' om de matrix in één klik volgens best-practice standaarden in te stellen.</w:t>
+        <w:br/>
+        <w:t>• Speciale Optie 'Alleen eigen registraties tonen': Wanneer aangevinkt, wordt de Digidokter-filterdropdown in het registratieoverzicht verborgen en ziet de gebruiker uitsluitend de consultaties die aan zijn/haar eigen Digidokter-profiel gekoppeld zijn.</w:t>
+        <w:br/>
+        <w:t>• Meervoudige Groepstoewijzing: Gebruikers kunnen aan meerdere groepen tegelijk worden gekoppeld. Het systeem past per module automatisch het hoogste recht toe (Schrijven &gt; Lezen &gt; Geen).</w:t>
+        <w:br/>
+        <w:t>• Beschermde Standaardgroepen: De vier standaardgroepen (Lezers, Medewerkers, Beheerders, Platformbeheerders) kunnen niet worden hernoemd of gewist, wat de stabiliteit van de organisatie waarborgt.</w:t>
+      </w:r>
+    </w:p>
+    <w:p>
+      <w:pPr/>
+    </w:p>
+    <w:p>
+      <w:pPr>
+        <w:pStyle w:val="Heading2"/>
+      </w:pPr>
+      <w:r>
+        <w:t>4.3 Stamgegevens beheren</w:t>
       </w:r>
     </w:p>
     <w:p>
@@ -595,7 +625,7 @@
         <w:pStyle w:val="Heading2"/>
       </w:pPr>
       <w:r>
-        <w:t>4.3 Evaluatieformulieren beheren &amp; Resultaten raadplegen</w:t>
+        <w:t>4.4 Evaluatieformulieren beheren &amp; Resultaten raadplegen</w:t>
       </w:r>
     </w:p>
     <w:p>
@@ -617,7 +647,7 @@
         <w:pStyle w:val="Heading2"/>
       </w:pPr>
       <w:r>
-        <w:t>4.4 Backup &amp; Restore</w:t>
+        <w:t>4.5 Backup &amp; Restore</w:t>
       </w:r>
     </w:p>
     <w:p>
@@ -631,7 +661,7 @@
         <w:pStyle w:val="Heading2"/>
       </w:pPr>
       <w:r>
-        <w:t>4.5 Audit Logs</w:t>
+        <w:t>4.6 Audit Logs</w:t>
       </w:r>
     </w:p>
     <w:p>
@@ -649,7 +679,7 @@
         <w:pStyle w:val="Heading2"/>
       </w:pPr>
       <w:r>
-        <w:t>4.6 Platformbeheer (enkel platformbeheerders)</w:t>
+        <w:t>4.7 Platformbeheer (enkel platformbeheerders)</w:t>
       </w:r>
     </w:p>
     <w:p>
@@ -659,7 +689,7 @@
         <w:br/>
         <w:t>• Vraagclassificaties &amp; Detail-popups: Onder 'Platformbeheer &gt; Vraagclassificaties' kunnen alle AI-classificaties worden gemonitord en handmatig gecorrigeerd. Klik op een rij om direct een popup-venster met alle details van de registratie te openen. Met de knop 'Batch-analyse starten' kunnen alle ongeclassificeerde vragen asynchroon op de achtergrond worden geanalyseerd met een realtime voortgangsbalk.</w:t>
         <w:br/>
-        <w:t>• Centrale Sjabloon-organisatie ('Sjabloon'): De organisatie 'Sjabloon' dient uitsluitend als referentie-blauwdruk voor stamgegevens. Transacties (registraties, agenda, documenten) zijn hierin uitgeschakeld om het standaardsjabloon zuiver te houden.</w:t>
+        <w:t>• Centrale Sjabloon-organisatie ('Sjabloon'): De organisatie 'Sjabloon' dient uitsluitend als referentie-blauwdruk voor stamgegevens en standaardgroepen. Transacties (registraties, agenda, documenten) zijn hierin uitgeschakeld om het standaardsjabloon zuiver te houden.</w:t>
       </w:r>
     </w:p>
     <w:p>

</xml_diff>

<commit_message>
feat: beheer van koppelingen met filters en wildcards, automatische rol-afleiding uit groepen, bescherming platformbeheerders en documentatie-update
</commit_message>
<xml_diff>
--- a/Digidokters_Gebruikershandleiding.docx
+++ b/Digidokters_Gebruikershandleiding.docx
@@ -576,7 +576,7 @@
     <w:p>
       <w:pPr/>
       <w:r>
-        <w:t>Via 'Beheer &gt; Gebruikers' kunt u de medewerkers en beheerders van uw organisatie beheren. U kunt nieuwe accounts aanmaken met een tijdelijk wachtwoord, wachtwoorden resetten, rollen en functies toekennen (zoals Digidokter, Digihelper, Lesgever), het telefoonnummer noteren en gebruikers toewijzen aan één of meerdere autorisatiegroepen van uw organisatie. Wanneer een gebruiker tot meerdere groepen behoort, worden de toegekende rechten gecombineerd volgens het principe 'hoogste recht telt'.</w:t>
+        <w:t>Via 'Beheer &gt; Gebruikers' kunt u de medewerkers en beheerders van uw organisatie beheren. U kunt nieuwe accounts aanmaken met een tijdelijk wachtwoord, wachtwoorden resetten, functies toekennen (zoals Digidokter, Digihelper, Lesgever), het telefoonnummer noteren en gebruikers toewijzen aan één of meerdere autorisatiegroepen van uw organisatie. Het systeem leidt de onderliggende rol automatisch af uit de geselecteerde groepen. Wanneer een gebruiker tot meerdere groepen behoort, worden de toegekende rechten gecombineerd volgens het principe 'hoogste recht telt'.</w:t>
       </w:r>
     </w:p>
     <w:p>
@@ -590,8 +590,6 @@
     <w:p>
       <w:pPr/>
       <w:r>
-        <w:t>Via 'Beheer &gt; Groepen' kunnen lokale beheerders het autorisatieschema van hun organisatie volledig op maat configureren:</w:t>
-        <w:br/>
         <w:t>• Fijnmazige Permissiematrix: Voor elke groep kan per functionele module (Registraties, Agenda, Evaluaties, Documenten, Statistieken, Export, Feedback, Stamgegevens, Gebruikers, Groepen, Backups, Auditlogs, App documentatie) het recht worden ingesteld op 'Geen toegang', 'Alleen lezen' of 'Lezen en schrijven'.</w:t>
         <w:br/>
         <w:t>• Snelknoppen (Presets): Gebruik de knoppen 'Stel in als Lezer', 'Stel in als Medewerker' of 'Stel in als Beheerder' om de matrix in één klik volgens best-practice standaarden in te stellen.</w:t>
@@ -600,7 +598,7 @@
         <w:br/>
         <w:t>• Meervoudige Groepstoewijzing: Gebruikers kunnen aan meerdere groepen tegelijk worden gekoppeld. Het systeem past per module automatisch het hoogste recht toe (Schrijven &gt; Lezen &gt; Geen).</w:t>
         <w:br/>
-        <w:t>• Beschermde Standaardgroepen: De vier standaardgroepen (Lezers, Medewerkers, Beheerders, Platformbeheerders) kunnen niet worden hernoemd of gewist, wat de stabiliteit van de organisatie waarborgt.</w:t>
+        <w:t>• Beschermde Standaardgroepen: De vier standaardgroepen (Lezers, Medewerkers, Beheerders, Platformbeheerders) kunnen niet worden hernoemd of gewist. De groep 'Platformbeheerders' is bovendien permanent beschermd tegen deactivatie en inperking van rechten om te allen tijde beheer van het platform te waarborgen.</w:t>
       </w:r>
     </w:p>
     <w:p>
@@ -685,6 +683,8 @@
     <w:p>
       <w:pPr/>
       <w:r>
+        <w:t>• Koppelingen Beheren &amp; Filters: Via 'Platformbeheer &gt; Koppelingen' kunnen gebruikerskoppelingen aan organisaties worden beheerd met flexibele filters op gebruiker (inclusief wildcards met * en ?), organisatie, groep en status. Het e-mailadres van de gebruiker is direct klikbaar om naar de bewerkfiche te springen. Nieuwe koppelingen kunnen direct worden toegewezen aan gewenste groepen.</w:t>
+        <w:br/>
         <w:t>• Aanpasbare e-mailsjablonen: Via 'Platformbeheer &gt; E-mailsjablonen' kunnen de standaardsjablonen voor uitnodigingen en herinneringen worden bewerkt met dynamische tags en een live preview.</w:t>
         <w:br/>
         <w:t>• Vraagclassificaties &amp; Detail-popups: Onder 'Platformbeheer &gt; Vraagclassificaties' kunnen alle AI-classificaties worden gemonitord en handmatig gecorrigeerd. Klik op een rij om direct een popup-venster met alle details van de registratie te openen. Met de knop 'Batch-analyse starten' kunnen alle ongeclassificeerde vragen asynchroon op de achtergrond worden geanalyseerd met een realtime voortgangsbalk.</w:t>

</xml_diff>

<commit_message>
docs: gebruikershandleiding, release notes, rollen & rechten en README.md bijgewerkt
</commit_message>
<xml_diff>
--- a/Digidokters_Gebruikershandleiding.docx
+++ b/Digidokters_Gebruikershandleiding.docx
@@ -677,7 +677,32 @@
         <w:pStyle w:val="Heading2"/>
       </w:pPr>
       <w:r>
-        <w:t>4.7 Platformbeheer (enkel platformbeheerders)</w:t>
+        <w:t>4.7 Interne Organisatiecommunicatie &amp; E-mails</w:t>
+      </w:r>
+    </w:p>
+    <w:p>
+      <w:pPr/>
+      <w:r>
+        <w:t>Onder 'Beheer &gt; Communicatie' kunnen beheerders gerichte e-mailberichten en updates sturen naar hun medewerkers en vrijwilligers:</w:t>
+        <w:br/>
+        <w:t>• Doelgroepselectie: Kies eenvoudig tussen 'Alle actieve gebruikers', 'Enkel beheerders' of 'Enkel medewerkers &amp; digidokters'.</w:t>
+        <w:br/>
+        <w:t>• Dynamische waarschuwingsindicatie: De interface toont automatisch realtime welke en hoeveel actieve accounts binnen de gekozen doelgroep geen e-mailadres hebben ingesteld.</w:t>
+        <w:br/>
+        <w:t>• Proefmail naar mezelf: Met de knop 'Testmail naar mezelf' kan de beheerder het bericht eerst als proefmail ontvangen (voorzien van voorvoegsel [PROEFMAIL]) zonder dat de doelgroep of de officiële verzendhistoriek wordt belast.</w:t>
+        <w:br/>
+        <w:t>• Volledige Verzendhistoriek: Elk verzonden bericht wordt gelogd met datum, tijd, afzender, onderwerp, berichttekst en een JSON-snapshot van alle geadresseerden voor transparante opvolging.</w:t>
+      </w:r>
+    </w:p>
+    <w:p>
+      <w:pPr/>
+    </w:p>
+    <w:p>
+      <w:pPr>
+        <w:pStyle w:val="Heading2"/>
+      </w:pPr>
+      <w:r>
+        <w:t>4.8 Platformbeheer (enkel platformbeheerders)</w:t>
       </w:r>
     </w:p>
     <w:p>

</xml_diff>

<commit_message>
feat: stamgegeven en registratie van resultaat/afloop van het bezoek toevoegen
- Nieuw model Resultaat (id, organisatie_id, omschrijving/naam) met multitenant ondersteuning
- Seeding van standaardwaarden voor alle organisaties (inclusief Sjabloon)
- Beheerpagina onder /beheer/resultaten (CRUD, toggle, sortering, veilige verwijdering)
- Conditionele weergave van keuzeveld Resultaat in registratieformulieren (add, quick, edit)
- Filteren en tonen van Resultaat in registratieoverzicht en detailweergave
- Statistiekenoverzicht 'Resultaat van het bezoek' in Tab 1 (zonder niet-gespecificeerd, percentages over ingevulde resultaten)
- Export filter op Resultaat (indien stamgegevens aanwezig) en kolom in CSV/Excel export
- Uitgebreide testsuite (tests/test_resultaten.py) en bijgewerkte documentatie (README, handleiding)
</commit_message>
<xml_diff>
--- a/Digidokters_Gebruikershandleiding.docx
+++ b/Digidokters_Gebruikershandleiding.docx
@@ -295,7 +295,7 @@
     <w:p>
       <w:pPr/>
       <w:r>
-        <w:t>Het menu-item 'Registraties' toont een overzicht van alle geregistreerde consultaties: datum, bezoeker, digidokter, nieuwe bezoeker (ja/nee), herkomst, geslacht/gender, onderwerp, leeftijdscategorie en toestel. U kan de lijst doorzoeken en filteren. Klik op een registratie om de detailweergave te openen, inclusief de automatische AI-vraagclassificatie (toegewezen categorie, betrouwbaarheidsscore en motivatie van het taalmodel). Medewerkers en beheerders kunnen hier ook registraties verwijderen (wissen) bij invoerfouten.</w:t>
+        <w:t>Het menu-item 'Registraties' toont een overzicht van alle geregistreerde consultaties: datum, bezoeker, digidokter, nieuwe bezoeker (ja/nee), herkomst, geslacht/gender, onderwerp, resultaat van het bezoek, leeftijdscategorie en toestel. U kan de lijst doorzoeken en filteren (inclusief op resultaat). Klik op een registratie om de detailweergave te openen, inclusief het geregistreerde resultaat en de automatische AI-vraagclassificatie (toegewezen categorie, betrouwbaarheidsscore en motivatie van het taalmodel). Medewerkers en beheerders kunnen hier ook registraties verwijderen (wissen) bij invoerfouten.</w:t>
         <w:br/>
         <w:br/>
         <w:t>Opmerking over de Digidokter-filter: Indien voor uw gebruikersgroep de restrictie 'Alleen eigen registraties tonen' is ingesteld, wordt het filterveld voor digidokters automatisch verborgen en krijgt u uitsluitend uw eigen geregistreerde consultaties te zien.</w:t>
@@ -319,6 +319,8 @@
         <w:t>• Touch-chips &amp; grote selectieknoppen: Duidelijke knoppen voor 'Nieuwe bezoeker (Ja/Nee)', geslacht, leeftijdscategorie en toesteltype.</w:t>
         <w:br/>
         <w:t>• Snelle tag-knoppen: Klik met één tik op populaire thema's zoals itsme, WhatsApp, E-mail, Smartschool of Wifi om het onderwerp direct in te vullen.</w:t>
+        <w:br/>
+        <w:t>• Resultaat van het bezoek: Onder 'Hulpvraag/onderwerp' kan optioneel het resultaat van het bezoek worden aangeduid (bijv. 'Vraag beantwoord', 'Bezoeker komt later terug', 'Bezoeker doorverwezen', 'Vraag onmogelijk te beantwoorden', 'Andere'). Dit keuzeveld verschijnt automatisch zodra de organisatie minstens één resultaat heeft ingevoerd in de stamgegevens.</w:t>
         <w:br/>
         <w:t>• Opslaan &amp; Volgende bezoeker: Eén grote knop slaat het bezoek direct op en zet het formulier meteen klaar voor de volgende bezoeker. Op de achtergrond start automatisch een asynchrone AI-analyse (Gemini) om de vraag in te delen in de passende categorie voor statistieken.</w:t>
       </w:r>
@@ -344,7 +346,7 @@
     <w:p>
       <w:pPr/>
       <w:r>
-        <w:t>Via 'Exporteren' kan u alle (of gefilterde) registraties downloaden als Excel- (.xlsx) of CSV-bestand. De gedownloade tabellen bevatten gestandaardiseerde kolomkoppen (waaronder 'Bezoeker', 'Nieuwe bezoeker' en de automatische AI-'Vraagclassificatie') voor eenvoudige verwerking en verdere analyse in externe rapporten.</w:t>
+        <w:t>Via 'Exporteren' kan u alle (of gefilterde) registraties downloaden als Excel- (.xlsx) of CSV-bestand. U kan filteren op periode, digidokter, locatie, leeftijdscategorie, toestel, geslacht, herkomst en resultaat (indien geconfigureerd). De gedownloade tabellen bevatten gestandaardiseerde kolomkoppen (waaronder 'Bezoeker', 'Nieuwe bezoeker', 'Resultaat' en de automatische AI-'Vraagclassificatie') voor eenvoudige verwerking en verdere analyse in externe rapporten.</w:t>
       </w:r>
     </w:p>
     <w:p>
@@ -360,7 +362,7 @@
       <w:r>
         <w:t>Onder 'Statistieken' vindt u gedetailleerde overzichten, KPI's en grafieken verdeeld over drie gespecialiseerde tabbladen:</w:t>
         <w:br/>
-        <w:t>• Tab 1: Bezoekers &amp; Consultaties: Totaal aantal consultaties, verdeling nieuwe versus terugkerende bezoekers, verdeling over consultatielocaties, leeftijdscategorieën, toestellen, herkomstkanalen, geslachtsverdeling en wekelijkse bezoekerstrends.</w:t>
+        <w:t>• Tab 1: Bezoekers &amp; Consultaties: Totaal aantal consultaties, verdeling nieuwe versus terugkerende bezoekers, verdeling over consultatielocaties, leeftijdscategorieën, toestellen, herkomstkanalen, geslachtsverdeling, wekelijkse bezoekerstrends en het overzicht 'Resultaat van het bezoek' met percentages berekend over alle consultaties met een geregistreerd resultaat.</w:t>
         <w:br/>
         <w:t>• Tab 2: Vrijwilligers &amp; Agenda: Totaal aantal gepresteerde uren door digidokters, maandelijkse inzet-trends, sessies per locatie en activiteitstype, en de bezoeker/vrijwilliger-ratio (druktest). Deze ratio houdt uitsluitend rekening met voorbije sessies.</w:t>
         <w:br/>
@@ -615,7 +617,7 @@
     <w:p>
       <w:pPr/>
       <w:r>
-        <w:t>Onder 'Beheer' vindt u pagina's voor 'Digidokters', 'Activiteitstypes', 'Locaties', 'Leeftijdscategorieën', 'Toestellen', 'Herkomst', 'Genderidentiteiten' en 'Functies'. Beheerders kunnen keuzelijsten aanpassen, activeren/deactiveren, de volgorde wijzigen en ongebruikte items veilig wissen. Op elke stamgegevenspagina is tevens een statusfilter aanwezig (Alle items, Enkel actieve items, Enkel gedeactiveerde items).</w:t>
+        <w:t>Onder 'Beheer' vindt u pagina's voor 'Digidokters', 'Activiteitstypes', 'Locaties', 'Leeftijdscategorieën', 'Toestellen', 'Herkomst', 'Genderidentiteiten', 'Functies' en 'Resultaten'. Beheerders kunnen keuzelijsten aanpassen, activeren/deactiveren, de volgorde wijzigen en ongebruikte items veilig wissen. Op elke stamgegevenspagina is tevens een statusfilter aanwezig (Alle items, Enkel actieve items, Enkel gedeactiveerde items). Bij 'Resultaten' kan worden ingesteld welke uitkomsten van een bezoek geregistreerd worden (bijv. 'Vraag beantwoord', 'Bezoeker komt later terug', 'Bezoeker doorverwezen', etc.). Indien een organisatie geen resultaten wenst te registreren, kan de lijst leeggemaakt worden, waarna het veld in het registratieformulier en de exportfilter automatisch verdwijnt.</w:t>
       </w:r>
     </w:p>
     <w:p>

</xml_diff>

<commit_message>
feat(agenda): voeg audit logging en concurrency lock toe voor aanwezigheden
- Registreer wijzigingen aan gekoppelde digidokters (aanwezigheden) in de audit logs
- Voeg AgendaItemLock model en lock-mechanisme toe om gelijktijdige bewerking te voorkomen
- Toon waarschuwing en schakel selectievakjes uit wanneer een activiteit al door een andere gebruiker wordt bewerkt
- Voeg SRI integrity hash toe aan Chart.js in systeemmonitor (SonarQube fix)
- Update documentatie, gebruikershandleiding en audit rapporten (GDPR/Security 27-10-2026)
</commit_message>
<xml_diff>
--- a/Digidokters_Gebruikershandleiding.docx
+++ b/Digidokters_Gebruikershandleiding.docx
@@ -250,6 +250,9 @@
       <w:pPr/>
       <w:r>
         <w:t>Bij de allereerste aanmelding met een door de beheerder aangemaakt tijdelijk wachtwoord vraagt de app u om onmiddellijk een nieuw, persoonlijk wachtwoord in te stellen. Uw actieve organisatie blijft hierbij automatisch bewaard, zodat u direct aan de slag kunt. Dit wachtwoord moet minstens 8 tekens bevatten, met minstens één hoofdletter en één cijfer.</w:t>
+        <w:br/>
+        <w:br/>
+        <w:t>Wisselen van organisatie: Gebruikers die gekoppeld zijn aan meerdere organisaties (en platformbeheerders) kunnen via de organisatieschakelaar vlot tussen gemeenten wisselen. Het platform behoudt hierbij automatisch uw huidige menukeuze en geopende pagina (indien toegestaan binnen de geselecteerde organisatie), zodat u direct verder kunt werken zonder terug te springen naar het beginscherm.</w:t>
       </w:r>
     </w:p>
     <w:p>
@@ -669,7 +672,13 @@
       <w:r>
         <w:t>Beheerders en platformbeheerders kunnen alle wijzigingen aan gegevens binnen de applicatie raadplegen via het menu 'Beheer &gt; Audit Logs'.</w:t>
         <w:br/>
-        <w:t>Hier wordt automatisch elke CRUD-actie (aanmaken, wijzigen, verwijderen) geregistreerd met het tijdstip, de uitvoerende gebruiker, de tabelnaam en het record-ID. Standaard worden inlogacties (waarbij enkel de inlogtijdstip van een gebruiker wordt bijgewerkt) verborgen in het overzicht. U kunt deze inlogacties wel zichtbaar maken door de filter-switch 'Toon ook logins' in te schakelen. U kunt de lijst filteren op datum (van-tot), gebruiker, operatie (CREATE, UPDATE, DELETE) en tabel. Klik op de knop 'Details' bij een log-item om de gewijzigde velden in een overzichtelijke tabel te vergelijken (oude versus nieuwe waarden).</w:t>
+        <w:t>Hier wordt automatisch elke CRUD-actie (aanmaken, wijzigen, verwijderen) geregistreerd met het tijdstip, de uitvoerende gebruiker, de tabelnaam en het record-ID. Standaard worden inlogacties (waarbij enkel het inlogtijdstip van een gebruiker wordt bijgewerkt) verborgen in het overzicht; schakel de optie 'Toon ook logins' in om deze wel te tonen.</w:t>
+        <w:br/>
+        <w:t>• Sorteerbare kolommen: Alle kolommen in het overzicht (Tijdstip, Gebruiker, Operatie, Tabel, Record ID en voor platformbeheerders Organisatie) zijn volledig interactief sorteerbaar. Klik op de kolomkop om te schakelen tussen oplopend en aflopend sorteren (zichtbaar via pijl-indicatoren). De sorteervolgorde blijft behouden bij het filteren en bladeren door pagina's.</w:t>
+        <w:br/>
+        <w:t>• Handige dropdownfilters: Om het opzoeken snel en foutloos te maken, zijn de filters voor 'Gebruiker' en 'Tabel' uitgevoerd als dropdownlijsten waarin alle relevante waarden alfabetisch gerangschikt zijn.</w:t>
+        <w:br/>
+        <w:t>• Filteren &amp; Details: Naast gebruiker en tabel kan gefilterd worden op datum (van-tot) en operatie (CREATE, UPDATE, DELETE). Klik op de knop 'Details' bij een log-item om de gewijzigde velden in een overzichtelijke tabel te vergelijken (oude versus nieuwe waarden).</w:t>
         <w:br/>
         <w:t>Ter ondersteuning zijn de unieke record-IDs van alle gegevens discreet in de gebruikersinterface vermeld (bijv. '#X' of 'ID: X' bij registraties, agenda-items, mappen en stamgegevens), zodat u deze eenvoudig kunt matchen met de audit logs.</w:t>
       </w:r>
@@ -710,6 +719,16 @@
     <w:p>
       <w:pPr/>
       <w:r>
+        <w:t>• Systeemmonitor (Gezondheid, Sessies, Telemetrie &amp; Fouten): Onder 'Platformbeheer &gt; Systeemmonitor' heeft de platformbeheerder toegang tot een realtime controle- en telemetriedashboard verdeeld over vier gerichte tabbladen:</w:t>
+        <w:br/>
+        <w:t xml:space="preserve">  - Gezondheid (Health): Realtime status- en responstijdcontroles van kerndiensten (database, Brevo mail/SMTP, sessies, schijfruimte en achtergrondtaken) met duidelijke gezondheidsindicatoren (Gezond/Let op/Fout).</w:t>
+        <w:br/>
+        <w:t xml:space="preserve">  - Gebruik &amp; Sessies: Inzicht in het actuele aantal ingelogde gebruikers (afgelopen 15 en 30 minuten), actieve sessies per aangesloten gemeente en een gedetailleerde gebruikerslijst met laatste activiteit.</w:t>
+        <w:br/>
+        <w:t xml:space="preserve">  - Telemetrie &amp; Pagina-activiteit: Statistieken over pageviews per pagina/endpoint (zowel van vandaag als over de afgelopen 30 dagen) en gebruiksintensiteit per organisatie.</w:t>
+        <w:br/>
+        <w:t xml:space="preserve">  - Systeemfoutenlogboek: Centraal overzicht van geregistreerde applicatiefouten (HTTP 500 serverfouten, mislukte inlogpogingen, 429 rate limits), inclusief technische details, endpoint, IP-adres en stacktrace, met de mogelijkheid om fouten te markeren als 'Opgelost' of te 'Heropenen'.</w:t>
+        <w:br/>
         <w:t>• Koppelingen Beheren &amp; Filters: Via 'Platformbeheer &gt; Koppelingen' kunnen gebruikerskoppelingen aan organisaties worden beheerd met flexibele filters op gebruiker (inclusief wildcards met * en ?), organisatie, groep en status. Het e-mailadres van de gebruiker is direct klikbaar om naar de bewerkfiche te springen. Nieuwe koppelingen kunnen direct worden toegewezen aan gewenste groepen.</w:t>
         <w:br/>
         <w:t>• Aanpasbare e-mailsjablonen: Via 'Platformbeheer &gt; E-mailsjablonen' kunnen de standaardsjablonen voor uitnodigingen en herinneringen worden bewerkt met dynamische tags en een live preview.</w:t>

</xml_diff>